<commit_message>
Consolidate the employment corpus into one manuscript
It was the primary result in two places. The standalone employment
draft is deleted and the corpus lives in the Business Ethics manuscript,
which already carried the author map, Kyle's section and Ubayet's
methodology.

The two drafts disagreed on the numbers and both were right on
different bases. All three codings reconciled against live data: the
pre-registered adverse-finding coding gives p = 0.0073, resolved-only
gives p = 0.041, sustained-across-all gives p = 0.165. A is primary, B
and C are reported as sensitivity analyses.

Tanvi Pokhriyal is now a co-author rather than a conditional
acknowledgement, because the corpus is the paper's primary result.

Stale figures cleared: HR n=5, public records n=7, the 0.63 reliability
value, and a sync dependency on two deleted PDFs.

Co-Authored-By: Claude Opus 5 <noreply@anthropic.com>
Claude-Session: https://claude.ai/code/session_01W9UtE7X76spacWeSvBH7tv
</commit_message>
<xml_diff>
--- a/research/FOIL_Article_Draft.docx
+++ b/research/FOIL_Article_Draft.docx
@@ -146,7 +146,7 @@
         <w:spacing w:after="140"/>
       </w:pPr>
       <w:r>
-        <w:t xml:space="preserve">A fourth analysis, testing the read against whether the agency prevailed on appeal, is null (p = 1.000). Given the first three findings that is the expected relationship: reconstructability and appellate disposition measure different things, and published decisions are selected for contested legal questions rather than for thin files. Applied by a different reviewer in an employment-law corpus that is not filtered by publication, the same instrument does show the association (6 of 8 against 1 of 8 sustained, p = 0.041), which is consistent with that boundary condition rather than with a weak instrument.</w:t>
+        <w:t xml:space="preserve">A fourth analysis, testing the read against whether the agency prevailed on appeal, is null (p = 1.000). Given the first three findings that is the expected relationship: reconstructability and appellate disposition measure different things, and published decisions are selected for contested legal questions rather than for thin files. Applied by a different reviewer in an employment-law corpus that is not filtered by publication, the same instrument does show the association (7 of 9 flagged records drew an adverse finding against 2 of 13 passed records, p = 0.0073), which is consistent with that boundary condition rather than with a weak instrument.</w:t>
       </w:r>
     </w:p>
     <w:p>
@@ -1653,7 +1653,7 @@
         <w:spacing w:after="140"/>
       </w:pPr>
       <w:r>
-        <w:t xml:space="preserve">In that corpus the read is associated with the documented outcome. Determinations read as Ready were sustained in 6 of 8 resolved cases (75.0 percent, 95 percent Wilson interval 40.9 to 92.9); determinations read as Needs work or Gap were sustained in 1 of 8 (12.5 percent, interval 2.2 to 47.1). Fisher's exact test, two-sided, p = 0.041, odds ratio 21.0.</w:t>
+        <w:t xml:space="preserve">In that corpus the read is associated with the documented outcome. On that study's pre-registered outcome coding, which asks whether a matter drew an adverse finding, records read as Needs work or Gap did so in 7 of 9 cases (77.8 percent, 95 percent Wilson interval 45.3 to 93.7) against 2 of 13 records read as Ready (15.4 percent, interval 4.3 to 42.2); Fisher's exact test, two-sided, p = 0.0073, odds ratio 19.25. On the coding that matches the specification check above, restricted to resolved dispositions, determinations read as Ready were sustained in 6 of 8 (75.0 percent, interval 40.9 to 92.9) against 1 of 8 for records read as incomplete (12.5 percent, interval 2.2 to 47.1); p = 0.041, odds ratio 21.0.</w:t>
       </w:r>
     </w:p>
     <w:p>
@@ -1759,7 +1759,7 @@
         <w:spacing w:after="140"/>
       </w:pPr>
       <w:r>
-        <w:t xml:space="preserve">The cross-domain observation in Section 5.6 is not a result of this study. It belongs to a separate employment-law corpus collected by a different reviewer, rests on 8 resolved cases, and is reported in full elsewhere. It is cited here only as a test of the boundary condition proposed in Section 5.5.</w:t>
+        <w:t xml:space="preserve">The cross-domain observation in Section 5.6 is not a result of this study. It belongs to a separate employment-law corpus of 22 adjudicated matters collected by a different reviewer, is reported in full in a companion manuscript, and is cited here only as a test of the boundary condition proposed in Section 5.5.</w:t>
       </w:r>
     </w:p>
     <w:p>

</xml_diff>